<commit_message>
Removed Docker, simplified the app's code
</commit_message>
<xml_diff>
--- a/documentation/EventFlow_Dokumentacio.docx
+++ b/documentation/EventFlow_Dokumentacio.docx
@@ -4035,7 +4035,7 @@
         <w:spacing w:before="60" w:after="80"/>
       </w:pPr>
       <w:r>
-        <w:t>Az EventFlow egyetlen repository-ban tartalmaz egy Node.js/Express REST API backendet (TypeScript) és egy React + Vite SPA frontendet (TypeScript). Az adatbázis MariaDB (MySQL-kompatibilis). Production módban a backend kiszolgálja a buildelt frontendet (dist/). Docker Compose telepítés támogatott.</w:t>
+        <w:t>Az EventFlow egyetlen repository-ban tartalmaz egy Node.js/Express REST API backendet (TypeScript) és egy React + Vite SPA frontendet (TypeScript). Az adatbázis MariaDB (MySQL-kompatibilis). Production módban a backend kiszolgálja a buildelt frontendet (dist/).</w:t>
       </w:r>
     </w:p>
     <w:p>
@@ -6025,11 +6025,6 @@
     </w:p>
     <w:p>
       <w:r>
-        <w:t>├── docker-compose.yml</w:t>
-      </w:r>
-    </w:p>
-    <w:p>
-      <w:r>
         <w:t>├── .env.example</w:t>
       </w:r>
     </w:p>
@@ -17399,62 +17394,6 @@
           </w:p>
         </w:tc>
       </w:tr>
-      <w:tr>
-        <w:tc>
-          <w:tcPr>
-            <w:tcW w:type="dxa" w:w="2852"/>
-            <w:tcBorders>
-              <w:top w:val="single" w:sz="1" w:space="0" w:color="CCCCCC"/>
-              <w:left w:val="single" w:sz="1" w:space="0" w:color="CCCCCC"/>
-              <w:bottom w:val="single" w:sz="1" w:space="0" w:color="CCCCCC"/>
-              <w:right w:val="single" w:sz="1" w:space="0" w:color="CCCCCC"/>
-            </w:tcBorders>
-            <w:shd w:val="clear" w:color="auto" w:fill="FFFFFF"/>
-            <w:tcMar>
-              <w:top w:w="80" w:type="dxa"/>
-              <w:left w:w="120" w:type="dxa"/>
-              <w:bottom w:w="80" w:type="dxa"/>
-              <w:right w:w="120" w:type="dxa"/>
-            </w:tcMar>
-          </w:tcPr>
-          <w:p>
-            <w:pPr/>
-            <w:r>
-              <w:rPr>
-                <w:sz w:val="20"/>
-              </w:rPr>
-              <w:t>DOCKER</w:t>
-            </w:r>
-          </w:p>
-        </w:tc>
-        <w:tc>
-          <w:tcPr>
-            <w:tcW w:type="dxa" w:w="6508"/>
-            <w:tcBorders>
-              <w:top w:val="single" w:sz="1" w:space="0" w:color="CCCCCC"/>
-              <w:left w:val="single" w:sz="1" w:space="0" w:color="CCCCCC"/>
-              <w:bottom w:val="single" w:sz="1" w:space="0" w:color="CCCCCC"/>
-              <w:right w:val="single" w:sz="1" w:space="0" w:color="CCCCCC"/>
-            </w:tcBorders>
-            <w:shd w:val="clear" w:color="auto" w:fill="FFFFFF"/>
-            <w:tcMar>
-              <w:top w:w="80" w:type="dxa"/>
-              <w:left w:w="120" w:type="dxa"/>
-              <w:bottom w:w="80" w:type="dxa"/>
-              <w:right w:w="120" w:type="dxa"/>
-            </w:tcMar>
-          </w:tcPr>
-          <w:p>
-            <w:pPr/>
-            <w:r>
-              <w:rPr>
-                <w:sz w:val="20"/>
-              </w:rPr>
-              <w:t>docker-compose.yml — app + MariaDB</w:t>
-            </w:r>
-          </w:p>
-        </w:tc>
-      </w:tr>
     </w:tbl>
     <w:p>
       <w:r>
@@ -17898,19 +17837,6 @@
       </w:pPr>
       <w:r>
         <w:t>Production: állítsd be a .env-ben NODE_ENV=production, JWT_SECRET, CLIENT_URL=http://localhost:3000; futtasd npm run build, majd npm run start. A backend kiszolgálja a dist/ mappát — a dist/index.html fájlt ne nyisd meg közvetlenül a böngészőben.</w:t>
-      </w:r>
-    </w:p>
-    <w:p>
-      <w:pPr>
-        <w:pStyle w:val="Listaszerbekezds"/>
-        <w:numPr>
-          <w:ilvl w:val="0"/>
-          <w:numId w:val="3"/>
-        </w:numPr>
-        <w:spacing w:before="40" w:after="40"/>
-      </w:pPr>
-      <w:r>
-        <w:t>Docker: docker compose up --build -d (app + MariaDB).</w:t>
       </w:r>
     </w:p>
     <w:p>

</xml_diff>